<commit_message>
Some fixes in documentation
</commit_message>
<xml_diff>
--- a/docs/documentation.docx
+++ b/docs/documentation.docx
@@ -76,7 +76,6 @@
           <w:color w:val="365F91"/>
           <w:sz w:val="28"/>
           <w:szCs w:val="28"/>
-          <w:lang w:val="ru-RU"/>
         </w:rPr>
       </w:pPr>
     </w:p>
@@ -565,6 +564,7 @@
       </w:pPr>
       <w:r>
         <w:rPr>
+          <w:noProof/>
           <w:lang w:val="ru-RU"/>
         </w:rPr>
         <w:drawing>
@@ -1121,6 +1121,7 @@
       </w:pPr>
       <w:r>
         <w:rPr>
+          <w:noProof/>
           <w:lang w:val="ru-RU"/>
         </w:rPr>
         <w:drawing>
@@ -1232,6 +1233,7 @@
       </w:pPr>
       <w:r>
         <w:rPr>
+          <w:noProof/>
           <w:lang w:val="ru-RU"/>
         </w:rPr>
         <w:drawing>
@@ -2847,7 +2849,7 @@
               <w:rPr>
                 <w:lang w:val="ru-RU"/>
               </w:rPr>
-              <w:t>Веб- фреймворк</w:t>
+              <w:t>Веб-фреймворк</w:t>
             </w:r>
           </w:p>
         </w:tc>
@@ -7005,40 +7007,18 @@
     </w:p>
     <w:tbl>
       <w:tblPr>
-        <w:tblW w:w="10080" w:type="dxa"/>
-        <w:tblBorders>
-          <w:top w:val="single" w:sz="2" w:space="0" w:color="auto"/>
-          <w:left w:val="single" w:sz="2" w:space="0" w:color="auto"/>
-          <w:bottom w:val="single" w:sz="2" w:space="0" w:color="auto"/>
-          <w:right w:val="single" w:sz="2" w:space="0" w:color="auto"/>
-        </w:tblBorders>
-        <w:shd w:val="clear" w:color="auto" w:fill="F8F7F6"/>
-        <w:tblCellMar>
-          <w:left w:w="0" w:type="dxa"/>
-          <w:right w:w="0" w:type="dxa"/>
-        </w:tblCellMar>
+        <w:tblStyle w:val="af1"/>
+        <w:tblW w:w="5815" w:type="dxa"/>
         <w:tblLook w:val="04A0" w:firstRow="1" w:lastRow="0" w:firstColumn="1" w:lastColumn="0" w:noHBand="0" w:noVBand="1"/>
       </w:tblPr>
       <w:tblGrid>
-        <w:gridCol w:w="2145"/>
-        <w:gridCol w:w="3995"/>
-        <w:gridCol w:w="3940"/>
+        <w:gridCol w:w="2436"/>
+        <w:gridCol w:w="3379"/>
       </w:tblGrid>
       <w:tr>
-        <w:trPr>
-          <w:tblHeader/>
-        </w:trPr>
-        <w:tc>
-          <w:tcPr>
-            <w:tcW w:w="0" w:type="auto"/>
-            <w:shd w:val="clear" w:color="auto" w:fill="F8F7F6"/>
-            <w:tcMar>
-              <w:top w:w="0" w:type="dxa"/>
-              <w:left w:w="0" w:type="dxa"/>
-              <w:bottom w:w="156" w:type="dxa"/>
-              <w:right w:w="0" w:type="dxa"/>
-            </w:tcMar>
-            <w:vAlign w:val="bottom"/>
+        <w:tc>
+          <w:tcPr>
+            <w:tcW w:w="0" w:type="auto"/>
             <w:hideMark/>
           </w:tcPr>
           <w:p>
@@ -7063,62 +7043,23 @@
         <w:tc>
           <w:tcPr>
             <w:tcW w:w="0" w:type="auto"/>
-            <w:shd w:val="clear" w:color="auto" w:fill="F8F7F6"/>
-            <w:tcMar>
-              <w:top w:w="0" w:type="dxa"/>
-              <w:left w:w="0" w:type="dxa"/>
-              <w:bottom w:w="156" w:type="dxa"/>
-              <w:right w:w="0" w:type="dxa"/>
-            </w:tcMar>
-            <w:vAlign w:val="bottom"/>
-            <w:hideMark/>
-          </w:tcPr>
-          <w:p>
-            <w:pPr>
-              <w:rPr>
-                <w:b/>
-                <w:bCs/>
-                <w:lang w:val="ru-RU"/>
-              </w:rPr>
-            </w:pPr>
-            <w:r>
-              <w:rPr>
-                <w:b/>
-                <w:bCs/>
-                <w:lang w:val="ru-RU"/>
-              </w:rPr>
-              <w:t>Настойчивость</w:t>
-            </w:r>
-          </w:p>
-        </w:tc>
-        <w:tc>
-          <w:tcPr>
-            <w:tcW w:w="0" w:type="auto"/>
-            <w:shd w:val="clear" w:color="auto" w:fill="F8F7F6"/>
-            <w:tcMar>
-              <w:top w:w="0" w:type="dxa"/>
-              <w:left w:w="0" w:type="dxa"/>
-              <w:bottom w:w="156" w:type="dxa"/>
-              <w:right w:w="0" w:type="dxa"/>
-            </w:tcMar>
-            <w:vAlign w:val="bottom"/>
-            <w:hideMark/>
-          </w:tcPr>
-          <w:p>
-            <w:pPr>
-              <w:rPr>
-                <w:b/>
-                <w:bCs/>
-                <w:lang w:val="ru-RU"/>
-              </w:rPr>
-            </w:pPr>
-            <w:r>
-              <w:rPr>
-                <w:b/>
-                <w:bCs/>
-                <w:lang w:val="ru-RU"/>
-              </w:rPr>
-              <w:t>Триггер восстановления</w:t>
+            <w:hideMark/>
+          </w:tcPr>
+          <w:p>
+            <w:pPr>
+              <w:rPr>
+                <w:b/>
+                <w:bCs/>
+                <w:lang w:val="ru-RU"/>
+              </w:rPr>
+            </w:pPr>
+            <w:r>
+              <w:rPr>
+                <w:b/>
+                <w:bCs/>
+                <w:lang w:val="ru-RU"/>
+              </w:rPr>
+              <w:t>Место хранения</w:t>
             </w:r>
           </w:p>
         </w:tc>
@@ -7127,14 +7068,6 @@
         <w:tc>
           <w:tcPr>
             <w:tcW w:w="0" w:type="auto"/>
-            <w:shd w:val="clear" w:color="auto" w:fill="F8F7F6"/>
-            <w:tcMar>
-              <w:top w:w="156" w:type="dxa"/>
-              <w:left w:w="0" w:type="dxa"/>
-              <w:bottom w:w="156" w:type="dxa"/>
-              <w:right w:w="0" w:type="dxa"/>
-            </w:tcMar>
-            <w:vAlign w:val="bottom"/>
             <w:hideMark/>
           </w:tcPr>
           <w:p>
@@ -7158,14 +7091,6 @@
         <w:tc>
           <w:tcPr>
             <w:tcW w:w="0" w:type="auto"/>
-            <w:shd w:val="clear" w:color="auto" w:fill="F8F7F6"/>
-            <w:tcMar>
-              <w:top w:w="156" w:type="dxa"/>
-              <w:left w:w="0" w:type="dxa"/>
-              <w:bottom w:w="156" w:type="dxa"/>
-              <w:right w:w="0" w:type="dxa"/>
-            </w:tcMar>
-            <w:vAlign w:val="bottom"/>
             <w:hideMark/>
           </w:tcPr>
           <w:p>
@@ -7203,43 +7128,6 @@
                 <w:lang w:val="ru-RU"/>
               </w:rPr>
               <w:t> ключ)</w:t>
-            </w:r>
-          </w:p>
-        </w:tc>
-        <w:tc>
-          <w:tcPr>
-            <w:tcW w:w="0" w:type="auto"/>
-            <w:shd w:val="clear" w:color="auto" w:fill="F8F7F6"/>
-            <w:tcMar>
-              <w:top w:w="156" w:type="dxa"/>
-              <w:left w:w="0" w:type="dxa"/>
-              <w:bottom w:w="156" w:type="dxa"/>
-              <w:right w:w="0" w:type="dxa"/>
-            </w:tcMar>
-            <w:vAlign w:val="bottom"/>
-            <w:hideMark/>
-          </w:tcPr>
-          <w:p>
-            <w:pPr>
-              <w:rPr>
-                <w:lang w:val="ru-RU"/>
-              </w:rPr>
-            </w:pPr>
-            <w:proofErr w:type="spellStart"/>
-            <w:r>
-              <w:rPr>
-                <w:b/>
-                <w:bCs/>
-                <w:lang w:val="ru-RU"/>
-              </w:rPr>
-              <w:t>useEffect</w:t>
-            </w:r>
-            <w:proofErr w:type="spellEnd"/>
-            <w:r>
-              <w:rPr>
-                <w:lang w:val="ru-RU"/>
-              </w:rPr>
-              <w:t> на горе</w:t>
             </w:r>
           </w:p>
         </w:tc>
@@ -7248,14 +7136,6 @@
         <w:tc>
           <w:tcPr>
             <w:tcW w:w="0" w:type="auto"/>
-            <w:shd w:val="clear" w:color="auto" w:fill="F8F7F6"/>
-            <w:tcMar>
-              <w:top w:w="156" w:type="dxa"/>
-              <w:left w:w="0" w:type="dxa"/>
-              <w:bottom w:w="156" w:type="dxa"/>
-              <w:right w:w="0" w:type="dxa"/>
-            </w:tcMar>
-            <w:vAlign w:val="bottom"/>
             <w:hideMark/>
           </w:tcPr>
           <w:p>
@@ -7279,54 +7159,25 @@
         <w:tc>
           <w:tcPr>
             <w:tcW w:w="0" w:type="auto"/>
-            <w:shd w:val="clear" w:color="auto" w:fill="F8F7F6"/>
-            <w:tcMar>
-              <w:top w:w="156" w:type="dxa"/>
-              <w:left w:w="0" w:type="dxa"/>
-              <w:bottom w:w="156" w:type="dxa"/>
-              <w:right w:w="0" w:type="dxa"/>
-            </w:tcMar>
-            <w:vAlign w:val="bottom"/>
-            <w:hideMark/>
-          </w:tcPr>
-          <w:p>
-            <w:pPr>
-              <w:rPr>
-                <w:lang w:val="ru-RU"/>
-              </w:rPr>
-            </w:pPr>
-            <w:r>
-              <w:rPr>
-                <w:lang w:val="ru-RU"/>
-              </w:rPr>
-              <w:t>Производный от присутствия токена</w:t>
-            </w:r>
-          </w:p>
-        </w:tc>
-        <w:tc>
-          <w:tcPr>
-            <w:tcW w:w="0" w:type="auto"/>
-            <w:shd w:val="clear" w:color="auto" w:fill="F8F7F6"/>
-            <w:tcMar>
-              <w:top w:w="156" w:type="dxa"/>
-              <w:left w:w="0" w:type="dxa"/>
-              <w:bottom w:w="156" w:type="dxa"/>
-              <w:right w:w="0" w:type="dxa"/>
-            </w:tcMar>
-            <w:vAlign w:val="bottom"/>
-            <w:hideMark/>
-          </w:tcPr>
-          <w:p>
-            <w:pPr>
-              <w:rPr>
-                <w:lang w:val="ru-RU"/>
-              </w:rPr>
-            </w:pPr>
-            <w:r>
-              <w:rPr>
-                <w:lang w:val="ru-RU"/>
-              </w:rPr>
-              <w:t>Проверка токена на монтировании</w:t>
+            <w:hideMark/>
+          </w:tcPr>
+          <w:p>
+            <w:pPr>
+              <w:rPr>
+                <w:lang w:val="ru-RU"/>
+              </w:rPr>
+            </w:pPr>
+            <w:r>
+              <w:rPr>
+                <w:lang w:val="ru-RU"/>
+              </w:rPr>
+              <w:t>Зависит</w:t>
+            </w:r>
+            <w:r>
+              <w:rPr>
+                <w:lang w:val="ru-RU"/>
+              </w:rPr>
+              <w:t xml:space="preserve"> от токена</w:t>
             </w:r>
           </w:p>
         </w:tc>
@@ -7335,14 +7186,6 @@
         <w:tc>
           <w:tcPr>
             <w:tcW w:w="0" w:type="auto"/>
-            <w:shd w:val="clear" w:color="auto" w:fill="F8F7F6"/>
-            <w:tcMar>
-              <w:top w:w="156" w:type="dxa"/>
-              <w:left w:w="0" w:type="dxa"/>
-              <w:bottom w:w="156" w:type="dxa"/>
-              <w:right w:w="0" w:type="dxa"/>
-            </w:tcMar>
-            <w:vAlign w:val="bottom"/>
             <w:hideMark/>
           </w:tcPr>
           <w:p>
@@ -7366,14 +7209,6 @@
         <w:tc>
           <w:tcPr>
             <w:tcW w:w="0" w:type="auto"/>
-            <w:shd w:val="clear" w:color="auto" w:fill="F8F7F6"/>
-            <w:tcMar>
-              <w:top w:w="156" w:type="dxa"/>
-              <w:left w:w="0" w:type="dxa"/>
-              <w:bottom w:w="156" w:type="dxa"/>
-              <w:right w:w="0" w:type="dxa"/>
-            </w:tcMar>
-            <w:vAlign w:val="bottom"/>
             <w:hideMark/>
           </w:tcPr>
           <w:p>
@@ -7411,33 +7246,6 @@
                 <w:lang w:val="ru-RU"/>
               </w:rPr>
               <w:t> ключ)</w:t>
-            </w:r>
-          </w:p>
-        </w:tc>
-        <w:tc>
-          <w:tcPr>
-            <w:tcW w:w="0" w:type="auto"/>
-            <w:shd w:val="clear" w:color="auto" w:fill="F8F7F6"/>
-            <w:tcMar>
-              <w:top w:w="156" w:type="dxa"/>
-              <w:left w:w="0" w:type="dxa"/>
-              <w:bottom w:w="156" w:type="dxa"/>
-              <w:right w:w="0" w:type="dxa"/>
-            </w:tcMar>
-            <w:vAlign w:val="bottom"/>
-            <w:hideMark/>
-          </w:tcPr>
-          <w:p>
-            <w:pPr>
-              <w:rPr>
-                <w:lang w:val="ru-RU"/>
-              </w:rPr>
-            </w:pPr>
-            <w:r>
-              <w:rPr>
-                <w:lang w:val="ru-RU"/>
-              </w:rPr>
-              <w:t>Разбор на монтировании</w:t>
             </w:r>
           </w:p>
         </w:tc>
@@ -7446,14 +7254,6 @@
         <w:tc>
           <w:tcPr>
             <w:tcW w:w="0" w:type="auto"/>
-            <w:shd w:val="clear" w:color="auto" w:fill="F8F7F6"/>
-            <w:tcMar>
-              <w:top w:w="156" w:type="dxa"/>
-              <w:left w:w="0" w:type="dxa"/>
-              <w:bottom w:w="156" w:type="dxa"/>
-              <w:right w:w="0" w:type="dxa"/>
-            </w:tcMar>
-            <w:vAlign w:val="bottom"/>
             <w:hideMark/>
           </w:tcPr>
           <w:p>
@@ -7477,14 +7277,6 @@
         <w:tc>
           <w:tcPr>
             <w:tcW w:w="0" w:type="auto"/>
-            <w:shd w:val="clear" w:color="auto" w:fill="F8F7F6"/>
-            <w:tcMar>
-              <w:top w:w="156" w:type="dxa"/>
-              <w:left w:w="0" w:type="dxa"/>
-              <w:bottom w:w="156" w:type="dxa"/>
-              <w:right w:w="0" w:type="dxa"/>
-            </w:tcMar>
-            <w:vAlign w:val="bottom"/>
             <w:hideMark/>
           </w:tcPr>
           <w:p>
@@ -7522,33 +7314,6 @@
                 <w:lang w:val="ru-RU"/>
               </w:rPr>
               <w:t> ключ)</w:t>
-            </w:r>
-          </w:p>
-        </w:tc>
-        <w:tc>
-          <w:tcPr>
-            <w:tcW w:w="0" w:type="auto"/>
-            <w:shd w:val="clear" w:color="auto" w:fill="F8F7F6"/>
-            <w:tcMar>
-              <w:top w:w="156" w:type="dxa"/>
-              <w:left w:w="0" w:type="dxa"/>
-              <w:bottom w:w="156" w:type="dxa"/>
-              <w:right w:w="0" w:type="dxa"/>
-            </w:tcMar>
-            <w:vAlign w:val="bottom"/>
-            <w:hideMark/>
-          </w:tcPr>
-          <w:p>
-            <w:pPr>
-              <w:rPr>
-                <w:lang w:val="ru-RU"/>
-              </w:rPr>
-            </w:pPr>
-            <w:r>
-              <w:rPr>
-                <w:lang w:val="ru-RU"/>
-              </w:rPr>
-              <w:t>Разбор на монтировании</w:t>
             </w:r>
           </w:p>
         </w:tc>
@@ -7557,14 +7322,6 @@
         <w:tc>
           <w:tcPr>
             <w:tcW w:w="0" w:type="auto"/>
-            <w:shd w:val="clear" w:color="auto" w:fill="F8F7F6"/>
-            <w:tcMar>
-              <w:top w:w="156" w:type="dxa"/>
-              <w:left w:w="0" w:type="dxa"/>
-              <w:bottom w:w="156" w:type="dxa"/>
-              <w:right w:w="0" w:type="dxa"/>
-            </w:tcMar>
-            <w:vAlign w:val="bottom"/>
             <w:hideMark/>
           </w:tcPr>
           <w:p>
@@ -7588,14 +7345,6 @@
         <w:tc>
           <w:tcPr>
             <w:tcW w:w="0" w:type="auto"/>
-            <w:shd w:val="clear" w:color="auto" w:fill="F8F7F6"/>
-            <w:tcMar>
-              <w:top w:w="156" w:type="dxa"/>
-              <w:left w:w="0" w:type="dxa"/>
-              <w:bottom w:w="156" w:type="dxa"/>
-              <w:right w:w="0" w:type="dxa"/>
-            </w:tcMar>
-            <w:vAlign w:val="bottom"/>
             <w:hideMark/>
           </w:tcPr>
           <w:p>
@@ -7633,49 +7382,6 @@
                 <w:lang w:val="ru-RU"/>
               </w:rPr>
               <w:t> ключ)</w:t>
-            </w:r>
-          </w:p>
-        </w:tc>
-        <w:tc>
-          <w:tcPr>
-            <w:tcW w:w="0" w:type="auto"/>
-            <w:shd w:val="clear" w:color="auto" w:fill="F8F7F6"/>
-            <w:tcMar>
-              <w:top w:w="156" w:type="dxa"/>
-              <w:left w:w="0" w:type="dxa"/>
-              <w:bottom w:w="156" w:type="dxa"/>
-              <w:right w:w="0" w:type="dxa"/>
-            </w:tcMar>
-            <w:vAlign w:val="bottom"/>
-            <w:hideMark/>
-          </w:tcPr>
-          <w:p>
-            <w:pPr>
-              <w:rPr>
-                <w:lang w:val="ru-RU"/>
-              </w:rPr>
-            </w:pPr>
-            <w:r>
-              <w:rPr>
-                <w:lang w:val="ru-RU"/>
-              </w:rPr>
-              <w:t>Только для </w:t>
-            </w:r>
-            <w:proofErr w:type="spellStart"/>
-            <w:r>
-              <w:rPr>
-                <w:b/>
-                <w:bCs/>
-                <w:lang w:val="ru-RU"/>
-              </w:rPr>
-              <w:t>incident-detail</w:t>
-            </w:r>
-            <w:proofErr w:type="spellEnd"/>
-            <w:r>
-              <w:rPr>
-                <w:lang w:val="ru-RU"/>
-              </w:rPr>
-              <w:t> страницы</w:t>
             </w:r>
           </w:p>
         </w:tc>
@@ -8225,7 +7931,6 @@
         <w:rPr>
           <w:lang w:val="ru-RU"/>
         </w:rPr>
-        <w:lastRenderedPageBreak/>
         <w:t>Доступны порты 80, 5173 и 8000</w:t>
       </w:r>
     </w:p>
@@ -8332,6 +8037,7 @@
           <w:bCs/>
           <w:lang w:val="ru-RU"/>
         </w:rPr>
+        <w:lastRenderedPageBreak/>
         <w:t>Переменные внутренней среды</w:t>
       </w:r>
     </w:p>
@@ -8657,7 +8363,6 @@
         <w:rPr>
           <w:i/>
           <w:iCs/>
-          <w:lang w:val="ru-RU"/>
         </w:rPr>
         <w:t>_</w:t>
       </w:r>
@@ -8672,7 +8377,6 @@
         <w:rPr>
           <w:i/>
           <w:iCs/>
-          <w:lang w:val="ru-RU"/>
         </w:rPr>
         <w:t>_</w:t>
       </w:r>
@@ -8687,7 +8391,6 @@
         <w:rPr>
           <w:i/>
           <w:iCs/>
-          <w:lang w:val="ru-RU"/>
         </w:rPr>
         <w:t>_</w:t>
       </w:r>
@@ -8702,7 +8405,6 @@
         <w:rPr>
           <w:i/>
           <w:iCs/>
-          <w:lang w:val="ru-RU"/>
         </w:rPr>
         <w:t>=</w:t>
       </w:r>
@@ -8717,7 +8419,6 @@
         <w:rPr>
           <w:i/>
           <w:iCs/>
-          <w:lang w:val="ru-RU"/>
         </w:rPr>
         <w:t>://</w:t>
       </w:r>
@@ -8732,11 +8433,9 @@
         <w:rPr>
           <w:i/>
           <w:iCs/>
-          <w:lang w:val="ru-RU"/>
         </w:rPr>
         <w:t>:8000/</w:t>
       </w:r>
-      <w:proofErr w:type="spellStart"/>
       <w:r>
         <w:rPr>
           <w:i/>
@@ -8744,7 +8443,6 @@
         </w:rPr>
         <w:t>api</w:t>
       </w:r>
-      <w:proofErr w:type="spellEnd"/>
     </w:p>
     <w:p>
       <w:pPr>
@@ -8810,13 +8508,7 @@
         <w:rPr>
           <w:lang w:val="ru-RU"/>
         </w:rPr>
-        <w:t>: Переключение режима разработки</w:t>
-      </w:r>
-      <w:r>
-        <w:rPr>
-          <w:lang w:val="ru-RU"/>
-        </w:rPr>
-        <w:t xml:space="preserve"> </w:t>
+        <w:t xml:space="preserve">: Переключение режима разработки </w:t>
       </w:r>
     </w:p>
     <w:p>
@@ -8855,13 +8547,7 @@
         <w:rPr>
           <w:lang w:val="ru-RU"/>
         </w:rPr>
-        <w:t>: Список допустимых заголовков хостов, разделенных запятыми</w:t>
-      </w:r>
-      <w:r>
-        <w:rPr>
-          <w:lang w:val="ru-RU"/>
-        </w:rPr>
-        <w:t xml:space="preserve"> </w:t>
+        <w:t xml:space="preserve">: Список допустимых заголовков хостов, разделенных запятыми </w:t>
       </w:r>
     </w:p>
     <w:p>
@@ -8870,6 +8556,9 @@
           <w:ilvl w:val="0"/>
           <w:numId w:val="6"/>
         </w:numPr>
+        <w:rPr>
+          <w:lang w:val="ru-RU"/>
+        </w:rPr>
       </w:pPr>
       <w:r>
         <w:rPr>
@@ -8878,6 +8567,9 @@
         <w:t>Учетные</w:t>
       </w:r>
       <w:r>
+        <w:rPr>
+          <w:lang w:val="ru-RU"/>
+        </w:rPr>
         <w:t xml:space="preserve"> </w:t>
       </w:r>
       <w:r>
@@ -8887,6 +8579,9 @@
         <w:t>данные</w:t>
       </w:r>
       <w:r>
+        <w:rPr>
+          <w:lang w:val="ru-RU"/>
+        </w:rPr>
         <w:t xml:space="preserve"> </w:t>
       </w:r>
       <w:r>
@@ -8896,6 +8591,9 @@
         <w:t>для</w:t>
       </w:r>
       <w:r>
+        <w:rPr>
+          <w:lang w:val="ru-RU"/>
+        </w:rPr>
         <w:t xml:space="preserve"> </w:t>
       </w:r>
       <w:r>
@@ -8905,6 +8603,9 @@
         <w:t>доступа</w:t>
       </w:r>
       <w:r>
+        <w:rPr>
+          <w:lang w:val="ru-RU"/>
+        </w:rPr>
         <w:t xml:space="preserve"> </w:t>
       </w:r>
       <w:r>
@@ -8914,6 +8615,9 @@
         <w:t>к</w:t>
       </w:r>
       <w:r>
+        <w:rPr>
+          <w:lang w:val="ru-RU"/>
+        </w:rPr>
         <w:t xml:space="preserve"> </w:t>
       </w:r>
       <w:r>
@@ -8923,6 +8627,9 @@
         <w:t>базе</w:t>
       </w:r>
       <w:r>
+        <w:rPr>
+          <w:lang w:val="ru-RU"/>
+        </w:rPr>
         <w:t xml:space="preserve"> </w:t>
       </w:r>
       <w:r>
@@ -8932,54 +8639,159 @@
         <w:t>данных</w:t>
       </w:r>
       <w:r>
-        <w:t>: </w:t>
-      </w:r>
-      <w:r>
-        <w:rPr>
-          <w:b/>
-          <w:bCs/>
-        </w:rPr>
-        <w:t>DB_NAME</w:t>
-      </w:r>
-      <w:r>
-        <w:t>, </w:t>
-      </w:r>
-      <w:r>
-        <w:rPr>
-          <w:b/>
-          <w:bCs/>
-        </w:rPr>
-        <w:t>DB_USER</w:t>
-      </w:r>
-      <w:r>
-        <w:t>, </w:t>
-      </w:r>
-      <w:r>
-        <w:rPr>
-          <w:b/>
-          <w:bCs/>
-        </w:rPr>
-        <w:t>DB_PASSWORD</w:t>
-      </w:r>
-      <w:r>
-        <w:t>, </w:t>
-      </w:r>
-      <w:r>
-        <w:rPr>
-          <w:b/>
-          <w:bCs/>
-        </w:rPr>
-        <w:t>DB_HOST</w:t>
-      </w:r>
-      <w:r>
-        <w:t>, </w:t>
-      </w:r>
-      <w:r>
-        <w:rPr>
-          <w:b/>
-          <w:bCs/>
-        </w:rPr>
-        <w:t>DB_PORT</w:t>
+        <w:rPr>
+          <w:lang w:val="ru-RU"/>
+        </w:rPr>
+        <w:t>:</w:t>
+      </w:r>
+      <w:r>
+        <w:t> </w:t>
+      </w:r>
+      <w:r>
+        <w:rPr>
+          <w:b/>
+          <w:bCs/>
+        </w:rPr>
+        <w:t>DB</w:t>
+      </w:r>
+      <w:r>
+        <w:rPr>
+          <w:b/>
+          <w:bCs/>
+          <w:lang w:val="ru-RU"/>
+        </w:rPr>
+        <w:t>_</w:t>
+      </w:r>
+      <w:r>
+        <w:rPr>
+          <w:b/>
+          <w:bCs/>
+        </w:rPr>
+        <w:t>NAME</w:t>
+      </w:r>
+      <w:r>
+        <w:rPr>
+          <w:lang w:val="ru-RU"/>
+        </w:rPr>
+        <w:t>,</w:t>
+      </w:r>
+      <w:r>
+        <w:t> </w:t>
+      </w:r>
+      <w:r>
+        <w:rPr>
+          <w:b/>
+          <w:bCs/>
+        </w:rPr>
+        <w:t>DB</w:t>
+      </w:r>
+      <w:r>
+        <w:rPr>
+          <w:b/>
+          <w:bCs/>
+          <w:lang w:val="ru-RU"/>
+        </w:rPr>
+        <w:t>_</w:t>
+      </w:r>
+      <w:r>
+        <w:rPr>
+          <w:b/>
+          <w:bCs/>
+        </w:rPr>
+        <w:t>USER</w:t>
+      </w:r>
+      <w:r>
+        <w:rPr>
+          <w:lang w:val="ru-RU"/>
+        </w:rPr>
+        <w:t>,</w:t>
+      </w:r>
+      <w:r>
+        <w:t> </w:t>
+      </w:r>
+      <w:r>
+        <w:rPr>
+          <w:b/>
+          <w:bCs/>
+        </w:rPr>
+        <w:t>DB</w:t>
+      </w:r>
+      <w:r>
+        <w:rPr>
+          <w:b/>
+          <w:bCs/>
+          <w:lang w:val="ru-RU"/>
+        </w:rPr>
+        <w:t>_</w:t>
+      </w:r>
+      <w:r>
+        <w:rPr>
+          <w:b/>
+          <w:bCs/>
+        </w:rPr>
+        <w:t>PASSWORD</w:t>
+      </w:r>
+      <w:r>
+        <w:rPr>
+          <w:lang w:val="ru-RU"/>
+        </w:rPr>
+        <w:t>,</w:t>
+      </w:r>
+      <w:r>
+        <w:t> </w:t>
+      </w:r>
+      <w:r>
+        <w:rPr>
+          <w:b/>
+          <w:bCs/>
+        </w:rPr>
+        <w:t>DB</w:t>
+      </w:r>
+      <w:r>
+        <w:rPr>
+          <w:b/>
+          <w:bCs/>
+          <w:lang w:val="ru-RU"/>
+        </w:rPr>
+        <w:t>_</w:t>
+      </w:r>
+      <w:r>
+        <w:rPr>
+          <w:b/>
+          <w:bCs/>
+        </w:rPr>
+        <w:t>HOST</w:t>
+      </w:r>
+      <w:r>
+        <w:rPr>
+          <w:lang w:val="ru-RU"/>
+        </w:rPr>
+        <w:t>,</w:t>
+      </w:r>
+      <w:r>
+        <w:t> </w:t>
+      </w:r>
+      <w:r>
+        <w:rPr>
+          <w:b/>
+          <w:bCs/>
+        </w:rPr>
+        <w:t>DB</w:t>
+      </w:r>
+      <w:r>
+        <w:rPr>
+          <w:b/>
+          <w:bCs/>
+          <w:lang w:val="ru-RU"/>
+        </w:rPr>
+        <w:t>_</w:t>
+      </w:r>
+      <w:r>
+        <w:rPr>
+          <w:b/>
+          <w:bCs/>
+        </w:rPr>
+        <w:t>PORT</w:t>
       </w:r>
     </w:p>
     <w:p>
@@ -9018,7 +8830,6 @@
         <w:rPr>
           <w:lang w:val="ru-RU"/>
         </w:rPr>
-        <w:lastRenderedPageBreak/>
         <w:t xml:space="preserve">Конфигурация маршрута </w:t>
       </w:r>
       <w:proofErr w:type="spellStart"/>
@@ -9227,6 +9038,7 @@
                 <w:bCs/>
                 <w:lang w:val="ru-RU"/>
               </w:rPr>
+              <w:lastRenderedPageBreak/>
               <w:t>/</w:t>
             </w:r>
             <w:proofErr w:type="spellStart"/>
@@ -9285,7 +9097,13 @@
               <w:rPr>
                 <w:lang w:val="ru-RU"/>
               </w:rPr>
-              <w:t xml:space="preserve">Конечные точки </w:t>
+              <w:t>Функции</w:t>
+            </w:r>
+            <w:r>
+              <w:rPr>
+                <w:lang w:val="ru-RU"/>
+              </w:rPr>
+              <w:t xml:space="preserve"> </w:t>
             </w:r>
             <w:proofErr w:type="spellStart"/>
             <w:r>
@@ -9646,8 +9464,75 @@
       </w:r>
     </w:p>
     <w:p>
-      <w:r>
-        <w:t>git clone https://github.com/Kairo423/LK-</w:t>
+      <w:pPr>
+        <w:rPr>
+          <w:lang w:val="ru-RU"/>
+        </w:rPr>
+      </w:pPr>
+      <w:r>
+        <w:t>git</w:t>
+      </w:r>
+      <w:r>
+        <w:rPr>
+          <w:lang w:val="ru-RU"/>
+        </w:rPr>
+        <w:t xml:space="preserve"> </w:t>
+      </w:r>
+      <w:r>
+        <w:t>clone</w:t>
+      </w:r>
+      <w:r>
+        <w:rPr>
+          <w:lang w:val="ru-RU"/>
+        </w:rPr>
+        <w:t xml:space="preserve"> </w:t>
+      </w:r>
+      <w:r>
+        <w:t>https</w:t>
+      </w:r>
+      <w:r>
+        <w:rPr>
+          <w:lang w:val="ru-RU"/>
+        </w:rPr>
+        <w:t>://</w:t>
+      </w:r>
+      <w:proofErr w:type="spellStart"/>
+      <w:r>
+        <w:t>github</w:t>
+      </w:r>
+      <w:proofErr w:type="spellEnd"/>
+      <w:r>
+        <w:rPr>
+          <w:lang w:val="ru-RU"/>
+        </w:rPr>
+        <w:t>.</w:t>
+      </w:r>
+      <w:r>
+        <w:t>com</w:t>
+      </w:r>
+      <w:r>
+        <w:rPr>
+          <w:lang w:val="ru-RU"/>
+        </w:rPr>
+        <w:t>/</w:t>
+      </w:r>
+      <w:r>
+        <w:t>Kairo</w:t>
+      </w:r>
+      <w:r>
+        <w:rPr>
+          <w:lang w:val="ru-RU"/>
+        </w:rPr>
+        <w:t>423/</w:t>
+      </w:r>
+      <w:r>
+        <w:t>LK</w:t>
+      </w:r>
+      <w:r>
+        <w:rPr>
+          <w:lang w:val="ru-RU"/>
+        </w:rPr>
+        <w:t>-</w:t>
       </w:r>
       <w:r>
         <w:rPr>
@@ -9657,7 +9542,22 @@
         <w:t>for</w:t>
       </w:r>
       <w:r>
-        <w:t>-recording-incidents</w:t>
+        <w:rPr>
+          <w:lang w:val="ru-RU"/>
+        </w:rPr>
+        <w:t>-</w:t>
+      </w:r>
+      <w:r>
+        <w:t>recording</w:t>
+      </w:r>
+      <w:r>
+        <w:rPr>
+          <w:lang w:val="ru-RU"/>
+        </w:rPr>
+        <w:t>-</w:t>
+      </w:r>
+      <w:r>
+        <w:t>incidents</w:t>
       </w:r>
     </w:p>
     <w:p>
@@ -10046,72 +9946,34 @@
     </w:p>
     <w:p>
       <w:r>
+        <w:t>docker-</w:t>
+      </w:r>
+      <w:proofErr w:type="gramStart"/>
+      <w:r>
+        <w:t>compose</w:t>
+      </w:r>
+      <w:proofErr w:type="gramEnd"/>
+      <w:r>
+        <w:t xml:space="preserve"> logs frontend</w:t>
+      </w:r>
+    </w:p>
+    <w:p>
+      <w:r>
+        <w:t>docker-compose logs nginx</w:t>
+      </w:r>
+    </w:p>
+    <w:p>
+      <w:pPr>
+        <w:pStyle w:val="2"/>
+        <w:rPr>
+          <w:lang w:val="ru-RU"/>
+        </w:rPr>
+      </w:pPr>
+      <w:r>
+        <w:rPr>
+          <w:lang w:val="ru-RU"/>
+        </w:rPr>
         <w:lastRenderedPageBreak/>
-        <w:t>docker-</w:t>
-      </w:r>
-      <w:proofErr w:type="gramStart"/>
-      <w:r>
-        <w:t>compose</w:t>
-      </w:r>
-      <w:proofErr w:type="gramEnd"/>
-      <w:r>
-        <w:t xml:space="preserve"> logs frontend</w:t>
-      </w:r>
-    </w:p>
-    <w:p>
-      <w:pPr>
-        <w:rPr>
-          <w:lang w:val="ru-RU"/>
-        </w:rPr>
-      </w:pPr>
-      <w:proofErr w:type="spellStart"/>
-      <w:r>
-        <w:rPr>
-          <w:lang w:val="ru-RU"/>
-        </w:rPr>
-        <w:t>docker-compose</w:t>
-      </w:r>
-      <w:proofErr w:type="spellEnd"/>
-      <w:r>
-        <w:rPr>
-          <w:lang w:val="ru-RU"/>
-        </w:rPr>
-        <w:t xml:space="preserve"> </w:t>
-      </w:r>
-      <w:proofErr w:type="spellStart"/>
-      <w:r>
-        <w:rPr>
-          <w:lang w:val="ru-RU"/>
-        </w:rPr>
-        <w:t>logs</w:t>
-      </w:r>
-      <w:proofErr w:type="spellEnd"/>
-      <w:r>
-        <w:rPr>
-          <w:lang w:val="ru-RU"/>
-        </w:rPr>
-        <w:t xml:space="preserve"> </w:t>
-      </w:r>
-      <w:proofErr w:type="spellStart"/>
-      <w:r>
-        <w:rPr>
-          <w:lang w:val="ru-RU"/>
-        </w:rPr>
-        <w:t>nginx</w:t>
-      </w:r>
-      <w:proofErr w:type="spellEnd"/>
-    </w:p>
-    <w:p>
-      <w:pPr>
-        <w:pStyle w:val="2"/>
-        <w:rPr>
-          <w:lang w:val="ru-RU"/>
-        </w:rPr>
-      </w:pPr>
-      <w:r>
-        <w:rPr>
-          <w:lang w:val="ru-RU"/>
-        </w:rPr>
         <w:t>Создание первого администратора</w:t>
       </w:r>
     </w:p>
@@ -10572,6 +10434,11 @@
       </w:r>
     </w:p>
     <w:p>
+      <w:pPr>
+        <w:rPr>
+          <w:lang w:val="ru-RU"/>
+        </w:rPr>
+      </w:pPr>
       <w:r>
         <w:rPr>
           <w:lang w:val="ru-RU"/>
@@ -10929,7 +10796,6 @@
               </w:rPr>
             </w:pPr>
             <w:r>
-              <w:lastRenderedPageBreak/>
               <w:t>Django Admin</w:t>
             </w:r>
           </w:p>
@@ -11007,6 +10873,7 @@
               </w:rPr>
             </w:pPr>
             <w:r>
+              <w:lastRenderedPageBreak/>
               <w:t>API Documentation</w:t>
             </w:r>
           </w:p>
@@ -12109,6 +11976,7 @@
         <w:rPr>
           <w:b/>
           <w:bCs/>
+          <w:lang w:val="ru-RU"/>
         </w:rPr>
       </w:pPr>
     </w:p>
@@ -13073,6 +12941,7 @@
       </w:pPr>
       <w:r>
         <w:rPr>
+          <w:noProof/>
           <w:lang w:val="ru-RU"/>
         </w:rPr>
         <w:drawing>
@@ -25400,6 +25269,7 @@
   <w:style w:type="character" w:default="1" w:styleId="a0">
     <w:name w:val="Default Paragraph Font"/>
     <w:uiPriority w:val="1"/>
+    <w:semiHidden/>
     <w:unhideWhenUsed/>
   </w:style>
   <w:style w:type="table" w:default="1" w:styleId="a1">

</xml_diff>